<commit_message>
Update table of contents layout and cover page paths for the project report
</commit_message>
<xml_diff>
--- a/Compiler_Design_Project_Report.docx
+++ b/Compiler_Design_Project_Report.docx
@@ -4,603 +4,715 @@
   <w:body>
     <w:p>
       <w:pPr>
+        <w:spacing w:before="0" w:after="480"/>
+        <w:jc w:val="center"/>
+      </w:pPr>
+      <w:r>
+        <w:drawing>
+          <wp:inline xmlns:a="http://schemas.openxmlformats.org/drawingml/2006/main" xmlns:pic="http://schemas.openxmlformats.org/drawingml/2006/picture">
+            <wp:extent cx="2286000" cy="1090495"/>
+            <wp:docPr id="1" name="Picture 1"/>
+            <wp:cNvGraphicFramePr>
+              <a:graphicFrameLocks noChangeAspect="1"/>
+            </wp:cNvGraphicFramePr>
+            <a:graphic>
+              <a:graphicData uri="http://schemas.openxmlformats.org/drawingml/2006/picture">
+                <pic:pic>
+                  <pic:nvPicPr>
+                    <pic:cNvPr id="0" name="istun_logo.png"/>
+                    <pic:cNvPicPr/>
+                  </pic:nvPicPr>
+                  <pic:blipFill>
+                    <a:blip r:embed="rId9"/>
+                    <a:stretch>
+                      <a:fillRect/>
+                    </a:stretch>
+                  </pic:blipFill>
+                  <pic:spPr>
+                    <a:xfrm>
+                      <a:off x="0" y="0"/>
+                      <a:ext cx="2286000" cy="1090495"/>
+                    </a:xfrm>
+                    <a:prstGeom prst="rect"/>
+                  </pic:spPr>
+                </pic:pic>
+              </a:graphicData>
+            </a:graphic>
+          </wp:inline>
+        </w:drawing>
+      </w:r>
+    </w:p>
+    <w:p>
+      <w:pPr>
+        <w:spacing w:before="240" w:after="80"/>
+        <w:jc w:val="center"/>
+      </w:pPr>
+      <w:r>
+        <w:rPr>
+          <w:rFonts w:ascii="Calibri" w:hAnsi="Calibri"/>
+          <w:b/>
+          <w:color w:val="1F497D"/>
+          <w:sz w:val="28"/>
+        </w:rPr>
+        <w:t>ISTANBUL HEALTH AND TECHNOLOGY UNIVERSITY</w:t>
+      </w:r>
+    </w:p>
+    <w:p>
+      <w:pPr>
+        <w:spacing w:before="40" w:after="40"/>
+        <w:jc w:val="center"/>
+      </w:pPr>
+      <w:r>
+        <w:rPr>
+          <w:rFonts w:ascii="Calibri" w:hAnsi="Calibri"/>
+          <w:b/>
+          <w:color w:val="595959"/>
+          <w:sz w:val="22"/>
+        </w:rPr>
+        <w:t>FACULTY OF ENGINEERING AND NATURAL SCIENCES</w:t>
+      </w:r>
+    </w:p>
+    <w:p>
+      <w:pPr>
+        <w:spacing w:before="40" w:after="720"/>
+        <w:jc w:val="center"/>
+      </w:pPr>
+      <w:r>
+        <w:rPr>
+          <w:rFonts w:ascii="Calibri" w:hAnsi="Calibri"/>
+          <w:b/>
+          <w:color w:val="595959"/>
+          <w:sz w:val="22"/>
+        </w:rPr>
+        <w:t>DEPARTMENT OF COMPUTER ENGINEERING</w:t>
+      </w:r>
+    </w:p>
+    <w:p>
+      <w:pPr>
+        <w:spacing w:before="480" w:after="80"/>
+        <w:jc w:val="center"/>
+      </w:pPr>
+      <w:r>
+        <w:rPr>
+          <w:rFonts w:ascii="Calibri" w:hAnsi="Calibri"/>
+          <w:b/>
+          <w:sz w:val="20"/>
+        </w:rPr>
+        <w:t>2025 - 2026 ACADEMIC YEAR</w:t>
+      </w:r>
+    </w:p>
+    <w:p>
+      <w:pPr>
+        <w:spacing w:before="40" w:after="960"/>
+        <w:jc w:val="center"/>
+      </w:pPr>
+      <w:r>
+        <w:rPr>
+          <w:rFonts w:ascii="Calibri" w:hAnsi="Calibri"/>
+          <w:b/>
+          <w:sz w:val="20"/>
+        </w:rPr>
+        <w:t>3rd GRADE</w:t>
+      </w:r>
+    </w:p>
+    <w:p>
+      <w:pPr>
+        <w:spacing w:before="720" w:after="160"/>
+        <w:jc w:val="center"/>
+      </w:pPr>
+      <w:r>
+        <w:rPr>
+          <w:rFonts w:ascii="Calibri" w:hAnsi="Calibri"/>
+          <w:b/>
+          <w:color w:val="1F497D"/>
+          <w:sz w:val="28"/>
+        </w:rPr>
+        <w:t>SYSTEM PROGRAMMING</w:t>
+      </w:r>
+    </w:p>
+    <w:p>
+      <w:pPr>
+        <w:spacing w:before="80" w:after="1280"/>
+        <w:jc w:val="center"/>
+      </w:pPr>
+      <w:r>
+        <w:rPr>
+          <w:rFonts w:ascii="Calibri" w:hAnsi="Calibri"/>
+          <w:b/>
+          <w:color w:val="365F91"/>
+          <w:sz w:val="22"/>
+        </w:rPr>
+        <w:t>FINAL PROJECT: DESIGN AND IMPLEMENTATION OF A SIMPLE TWO-PASS COMPILER WITH INTERMEDIATE CODE GENERATION</w:t>
+      </w:r>
+    </w:p>
+    <w:p>
+      <w:pPr>
+        <w:spacing w:before="480" w:after="80"/>
+        <w:jc w:val="center"/>
+      </w:pPr>
+      <w:r>
+        <w:rPr>
+          <w:rFonts w:ascii="Calibri" w:hAnsi="Calibri"/>
+          <w:b/>
+          <w:sz w:val="21"/>
+        </w:rPr>
+        <w:t>Submitted by:</w:t>
+      </w:r>
+    </w:p>
+    <w:p>
+      <w:pPr>
+        <w:spacing w:before="40" w:after="40"/>
+        <w:jc w:val="center"/>
+      </w:pPr>
+      <w:r>
+        <w:rPr>
+          <w:rFonts w:ascii="Calibri" w:hAnsi="Calibri"/>
+          <w:sz w:val="22"/>
+        </w:rPr>
+        <w:t>Sercan Özkan | 220611005</w:t>
+      </w:r>
+    </w:p>
+    <w:p>
+      <w:pPr>
+        <w:spacing w:before="40" w:after="480"/>
+        <w:jc w:val="center"/>
+      </w:pPr>
+      <w:r>
+        <w:rPr>
+          <w:rFonts w:ascii="Calibri" w:hAnsi="Calibri"/>
+          <w:sz w:val="22"/>
+        </w:rPr>
+        <w:t>Berat Kahraman | 220610038</w:t>
+      </w:r>
+    </w:p>
+    <w:p>
+      <w:pPr>
+        <w:spacing w:before="240" w:after="80"/>
+        <w:jc w:val="center"/>
+      </w:pPr>
+      <w:r>
+        <w:rPr>
+          <w:rFonts w:ascii="Calibri" w:hAnsi="Calibri"/>
+          <w:b/>
+          <w:sz w:val="21"/>
+        </w:rPr>
+        <w:t>Submitted to:</w:t>
+      </w:r>
+    </w:p>
+    <w:p>
+      <w:pPr>
+        <w:spacing w:before="40" w:after="480"/>
+        <w:jc w:val="center"/>
+      </w:pPr>
+      <w:r>
+        <w:rPr>
+          <w:rFonts w:ascii="Calibri" w:hAnsi="Calibri"/>
+          <w:sz w:val="22"/>
+        </w:rPr>
+        <w:t>Instructor Kemal Çağrı Serdaroğlu</w:t>
+      </w:r>
+    </w:p>
+    <w:p>
+      <w:pPr>
+        <w:spacing w:before="240" w:after="0"/>
+        <w:jc w:val="center"/>
+      </w:pPr>
+      <w:r>
+        <w:rPr>
+          <w:rFonts w:ascii="Calibri" w:hAnsi="Calibri"/>
+          <w:sz w:val="22"/>
+        </w:rPr>
+        <w:t>Date of Submission: June 2, 2026</w:t>
+      </w:r>
+    </w:p>
+    <w:p>
+      <w:r>
+        <w:br w:type="page"/>
+      </w:r>
+    </w:p>
+    <w:p>
+      <w:pPr>
+        <w:spacing w:before="240" w:after="360"/>
+      </w:pPr>
+      <w:r>
+        <w:rPr>
+          <w:rFonts w:ascii="Calibri" w:hAnsi="Calibri"/>
+          <w:b/>
+          <w:color w:val="1F497D"/>
+          <w:sz w:val="32"/>
+        </w:rPr>
+        <w:t>Table of Contents</w:t>
+      </w:r>
+    </w:p>
+    <w:p>
+      <w:pPr>
+        <w:tabs>
+          <w:tab w:pos="9360" w:val="right" w:leader="dot"/>
+        </w:tabs>
+        <w:spacing w:before="80" w:after="80" w:line="276" w:lineRule="auto"/>
+      </w:pPr>
+      <w:r>
+        <w:rPr>
+          <w:rFonts w:ascii="Calibri" w:hAnsi="Calibri"/>
+          <w:sz w:val="22"/>
+        </w:rPr>
+        <w:t>1. Introduction</w:t>
+      </w:r>
+      <w:r>
+        <w:rPr>
+          <w:rFonts w:ascii="Calibri" w:hAnsi="Calibri"/>
+          <w:sz w:val="22"/>
+        </w:rPr>
+        <w:tab/>
+      </w:r>
+      <w:r>
+        <w:rPr>
+          <w:rFonts w:ascii="Calibri" w:hAnsi="Calibri"/>
+          <w:b/>
+          <w:sz w:val="22"/>
+        </w:rPr>
+        <w:t>3</w:t>
+      </w:r>
+    </w:p>
+    <w:p>
+      <w:pPr>
+        <w:tabs>
+          <w:tab w:pos="9360" w:val="right" w:leader="dot"/>
+        </w:tabs>
+        <w:spacing w:before="80" w:after="80" w:line="276" w:lineRule="auto"/>
+      </w:pPr>
+      <w:r>
+        <w:rPr>
+          <w:rFonts w:ascii="Calibri" w:hAnsi="Calibri"/>
+          <w:sz w:val="22"/>
+        </w:rPr>
+        <w:t>2. Methodology</w:t>
+      </w:r>
+      <w:r>
+        <w:rPr>
+          <w:rFonts w:ascii="Calibri" w:hAnsi="Calibri"/>
+          <w:sz w:val="22"/>
+        </w:rPr>
+        <w:tab/>
+      </w:r>
+      <w:r>
+        <w:rPr>
+          <w:rFonts w:ascii="Calibri" w:hAnsi="Calibri"/>
+          <w:b/>
+          <w:sz w:val="22"/>
+        </w:rPr>
+        <w:t>4</w:t>
+      </w:r>
+    </w:p>
+    <w:p>
+      <w:pPr>
+        <w:tabs>
+          <w:tab w:pos="9360" w:val="right" w:leader="dot"/>
+        </w:tabs>
+        <w:spacing w:before="80" w:after="80" w:line="276" w:lineRule="auto"/>
+      </w:pPr>
+      <w:r>
+        <w:rPr>
+          <w:rFonts w:ascii="Calibri" w:hAnsi="Calibri"/>
+          <w:sz w:val="22"/>
+        </w:rPr>
+        <w:t>3. Compiler Subsystem Architecture</w:t>
+      </w:r>
+      <w:r>
+        <w:rPr>
+          <w:rFonts w:ascii="Calibri" w:hAnsi="Calibri"/>
+          <w:sz w:val="22"/>
+        </w:rPr>
+        <w:tab/>
+      </w:r>
+      <w:r>
+        <w:rPr>
+          <w:rFonts w:ascii="Calibri" w:hAnsi="Calibri"/>
+          <w:b/>
+          <w:sz w:val="22"/>
+        </w:rPr>
+        <w:t>5</w:t>
+      </w:r>
+    </w:p>
+    <w:p>
+      <w:pPr>
+        <w:tabs>
+          <w:tab w:pos="9360" w:val="right" w:leader="dot"/>
+        </w:tabs>
+        <w:spacing w:before="80" w:after="80" w:line="276" w:lineRule="auto"/>
+      </w:pPr>
+      <w:r>
+        <w:rPr>
+          <w:rFonts w:ascii="Calibri" w:hAnsi="Calibri"/>
+          <w:sz w:val="22"/>
+        </w:rPr>
+        <w:t>4. Source Language Context-Free Grammar (CFG) &amp; BNF</w:t>
+      </w:r>
+      <w:r>
+        <w:rPr>
+          <w:rFonts w:ascii="Calibri" w:hAnsi="Calibri"/>
+          <w:sz w:val="22"/>
+        </w:rPr>
+        <w:tab/>
+      </w:r>
+      <w:r>
+        <w:rPr>
+          <w:rFonts w:ascii="Calibri" w:hAnsi="Calibri"/>
+          <w:b/>
+          <w:sz w:val="22"/>
+        </w:rPr>
+        <w:t>6</w:t>
+      </w:r>
+    </w:p>
+    <w:p>
+      <w:pPr>
+        <w:tabs>
+          <w:tab w:pos="9360" w:val="right" w:leader="dot"/>
+        </w:tabs>
+        <w:spacing w:before="80" w:after="80" w:line="276" w:lineRule="auto"/>
+      </w:pPr>
+      <w:r>
+        <w:rPr>
+          <w:rFonts w:ascii="Calibri" w:hAnsi="Calibri"/>
+          <w:sz w:val="22"/>
+        </w:rPr>
+        <w:t>5. Pass 1: Lexical Analysis (Lexer) Design &amp; Implementation</w:t>
+      </w:r>
+      <w:r>
+        <w:rPr>
+          <w:rFonts w:ascii="Calibri" w:hAnsi="Calibri"/>
+          <w:sz w:val="22"/>
+        </w:rPr>
+        <w:tab/>
+      </w:r>
+      <w:r>
+        <w:rPr>
+          <w:rFonts w:ascii="Calibri" w:hAnsi="Calibri"/>
+          <w:b/>
+          <w:sz w:val="22"/>
+        </w:rPr>
+        <w:t>8</w:t>
+      </w:r>
+    </w:p>
+    <w:p>
+      <w:pPr>
+        <w:tabs>
+          <w:tab w:pos="9360" w:val="right" w:leader="dot"/>
+        </w:tabs>
+        <w:spacing w:before="80" w:after="80" w:line="276" w:lineRule="auto"/>
+      </w:pPr>
+      <w:r>
+        <w:rPr>
+          <w:rFonts w:ascii="Calibri" w:hAnsi="Calibri"/>
+          <w:sz w:val="22"/>
+        </w:rPr>
+        <w:t>6. Pass 2: Syntax and Semantic Analysis (Parser) Design &amp; Implementation</w:t>
+      </w:r>
+      <w:r>
+        <w:rPr>
+          <w:rFonts w:ascii="Calibri" w:hAnsi="Calibri"/>
+          <w:sz w:val="22"/>
+        </w:rPr>
+        <w:tab/>
+      </w:r>
+      <w:r>
+        <w:rPr>
+          <w:rFonts w:ascii="Calibri" w:hAnsi="Calibri"/>
+          <w:b/>
+          <w:sz w:val="22"/>
+        </w:rPr>
+        <w:t>9</w:t>
+      </w:r>
+    </w:p>
+    <w:p>
+      <w:pPr>
+        <w:tabs>
+          <w:tab w:pos="9360" w:val="right" w:leader="dot"/>
+        </w:tabs>
+        <w:spacing w:before="80" w:after="80" w:line="276" w:lineRule="auto"/>
+      </w:pPr>
+      <w:r>
+        <w:rPr>
+          <w:rFonts w:ascii="Calibri" w:hAnsi="Calibri"/>
+          <w:sz w:val="22"/>
+        </w:rPr>
+        <w:t>7. Symbol Table Stack &amp; Simulated Memory Management</w:t>
+      </w:r>
+      <w:r>
+        <w:rPr>
+          <w:rFonts w:ascii="Calibri" w:hAnsi="Calibri"/>
+          <w:sz w:val="22"/>
+        </w:rPr>
+        <w:tab/>
+      </w:r>
+      <w:r>
+        <w:rPr>
+          <w:rFonts w:ascii="Calibri" w:hAnsi="Calibri"/>
+          <w:b/>
+          <w:sz w:val="22"/>
+        </w:rPr>
+        <w:t>11</w:t>
+      </w:r>
+    </w:p>
+    <w:p>
+      <w:pPr>
+        <w:tabs>
+          <w:tab w:pos="9360" w:val="right" w:leader="dot"/>
+        </w:tabs>
+        <w:spacing w:before="80" w:after="80" w:line="276" w:lineRule="auto"/>
+      </w:pPr>
+      <w:r>
+        <w:rPr>
+          <w:rFonts w:ascii="Calibri" w:hAnsi="Calibri"/>
+          <w:sz w:val="22"/>
+        </w:rPr>
+        <w:t>8. Static Semantics &amp; Type Checking System</w:t>
+      </w:r>
+      <w:r>
+        <w:rPr>
+          <w:rFonts w:ascii="Calibri" w:hAnsi="Calibri"/>
+          <w:sz w:val="22"/>
+        </w:rPr>
+        <w:tab/>
+      </w:r>
+      <w:r>
+        <w:rPr>
+          <w:rFonts w:ascii="Calibri" w:hAnsi="Calibri"/>
+          <w:b/>
+          <w:sz w:val="22"/>
+        </w:rPr>
+        <w:t>12</w:t>
+      </w:r>
+    </w:p>
+    <w:p>
+      <w:pPr>
+        <w:tabs>
+          <w:tab w:pos="9360" w:val="right" w:leader="dot"/>
+        </w:tabs>
+        <w:spacing w:before="80" w:after="80" w:line="276" w:lineRule="auto"/>
+      </w:pPr>
+      <w:r>
+        <w:rPr>
+          <w:rFonts w:ascii="Calibri" w:hAnsi="Calibri"/>
+          <w:sz w:val="22"/>
+        </w:rPr>
+        <w:t>9. Intermediate Representation: Three-Address Code (TAC) Generation</w:t>
+      </w:r>
+      <w:r>
+        <w:rPr>
+          <w:rFonts w:ascii="Calibri" w:hAnsi="Calibri"/>
+          <w:sz w:val="22"/>
+        </w:rPr>
+        <w:tab/>
+      </w:r>
+      <w:r>
+        <w:rPr>
+          <w:rFonts w:ascii="Calibri" w:hAnsi="Calibri"/>
+          <w:b/>
+          <w:sz w:val="22"/>
+        </w:rPr>
+        <w:t>14</w:t>
+      </w:r>
+    </w:p>
+    <w:p>
+      <w:pPr>
+        <w:tabs>
+          <w:tab w:pos="9360" w:val="right" w:leader="dot"/>
+        </w:tabs>
+        <w:spacing w:before="80" w:after="80" w:line="276" w:lineRule="auto"/>
+      </w:pPr>
+      <w:r>
+        <w:rPr>
+          <w:rFonts w:ascii="Calibri" w:hAnsi="Calibri"/>
+          <w:sz w:val="22"/>
+        </w:rPr>
+        <w:t>10. Error Handling &amp; Synchronization Recovery Strategy</w:t>
+      </w:r>
+      <w:r>
+        <w:rPr>
+          <w:rFonts w:ascii="Calibri" w:hAnsi="Calibri"/>
+          <w:sz w:val="22"/>
+        </w:rPr>
+        <w:tab/>
+      </w:r>
+      <w:r>
+        <w:rPr>
+          <w:rFonts w:ascii="Calibri" w:hAnsi="Calibri"/>
+          <w:b/>
+          <w:sz w:val="22"/>
+        </w:rPr>
+        <w:t>15</w:t>
+      </w:r>
+    </w:p>
+    <w:p>
+      <w:pPr>
+        <w:tabs>
+          <w:tab w:pos="9360" w:val="right" w:leader="dot"/>
+        </w:tabs>
+        <w:spacing w:before="80" w:after="80" w:line="276" w:lineRule="auto"/>
+      </w:pPr>
+      <w:r>
+        <w:rPr>
+          <w:rFonts w:ascii="Calibri" w:hAnsi="Calibri"/>
+          <w:sz w:val="22"/>
+        </w:rPr>
+        <w:t>11. User Interface (UI) &amp; Integrated Development Environment (IDE) Walkthrough</w:t>
+      </w:r>
+      <w:r>
+        <w:rPr>
+          <w:rFonts w:ascii="Calibri" w:hAnsi="Calibri"/>
+          <w:sz w:val="22"/>
+        </w:rPr>
+        <w:tab/>
+      </w:r>
+      <w:r>
+        <w:rPr>
+          <w:rFonts w:ascii="Calibri" w:hAnsi="Calibri"/>
+          <w:b/>
+          <w:sz w:val="22"/>
+        </w:rPr>
+        <w:t>16</w:t>
+      </w:r>
+    </w:p>
+    <w:p>
+      <w:pPr>
+        <w:tabs>
+          <w:tab w:pos="9360" w:val="right" w:leader="dot"/>
+        </w:tabs>
+        <w:spacing w:before="80" w:after="80" w:line="276" w:lineRule="auto"/>
+      </w:pPr>
+      <w:r>
+        <w:rPr>
+          <w:rFonts w:ascii="Calibri" w:hAnsi="Calibri"/>
+          <w:sz w:val="22"/>
+        </w:rPr>
+        <w:t>12. Challenges and Architectural Solutions</w:t>
+      </w:r>
+      <w:r>
+        <w:rPr>
+          <w:rFonts w:ascii="Calibri" w:hAnsi="Calibri"/>
+          <w:sz w:val="22"/>
+        </w:rPr>
+        <w:tab/>
+      </w:r>
+      <w:r>
+        <w:rPr>
+          <w:rFonts w:ascii="Calibri" w:hAnsi="Calibri"/>
+          <w:b/>
+          <w:sz w:val="22"/>
+        </w:rPr>
+        <w:t>17</w:t>
+      </w:r>
+    </w:p>
+    <w:p>
+      <w:pPr>
+        <w:tabs>
+          <w:tab w:pos="9360" w:val="right" w:leader="dot"/>
+        </w:tabs>
+        <w:spacing w:before="80" w:after="80" w:line="276" w:lineRule="auto"/>
+      </w:pPr>
+      <w:r>
+        <w:rPr>
+          <w:rFonts w:ascii="Calibri" w:hAnsi="Calibri"/>
+          <w:sz w:val="22"/>
+        </w:rPr>
+        <w:t>13. Limitations and Future Work</w:t>
+      </w:r>
+      <w:r>
+        <w:rPr>
+          <w:rFonts w:ascii="Calibri" w:hAnsi="Calibri"/>
+          <w:sz w:val="22"/>
+        </w:rPr>
+        <w:tab/>
+      </w:r>
+      <w:r>
+        <w:rPr>
+          <w:rFonts w:ascii="Calibri" w:hAnsi="Calibri"/>
+          <w:b/>
+          <w:sz w:val="22"/>
+        </w:rPr>
+        <w:t>18</w:t>
+      </w:r>
+    </w:p>
+    <w:p>
+      <w:pPr>
+        <w:tabs>
+          <w:tab w:pos="9360" w:val="right" w:leader="dot"/>
+        </w:tabs>
+        <w:spacing w:before="80" w:after="80" w:line="276" w:lineRule="auto"/>
+      </w:pPr>
+      <w:r>
+        <w:rPr>
+          <w:rFonts w:ascii="Calibri" w:hAnsi="Calibri"/>
+          <w:sz w:val="22"/>
+        </w:rPr>
+        <w:t>14. Conclusion</w:t>
+      </w:r>
+      <w:r>
+        <w:rPr>
+          <w:rFonts w:ascii="Calibri" w:hAnsi="Calibri"/>
+          <w:sz w:val="22"/>
+        </w:rPr>
+        <w:tab/>
+      </w:r>
+      <w:r>
+        <w:rPr>
+          <w:rFonts w:ascii="Calibri" w:hAnsi="Calibri"/>
+          <w:b/>
+          <w:sz w:val="22"/>
+        </w:rPr>
+        <w:t>19</w:t>
+      </w:r>
+    </w:p>
+    <w:p>
+      <w:pPr>
+        <w:tabs>
+          <w:tab w:pos="9360" w:val="right" w:leader="dot"/>
+        </w:tabs>
+        <w:spacing w:before="80" w:after="80" w:line="276" w:lineRule="auto"/>
+      </w:pPr>
+      <w:r>
+        <w:rPr>
+          <w:rFonts w:ascii="Calibri" w:hAnsi="Calibri"/>
+          <w:sz w:val="22"/>
+        </w:rPr>
+        <w:t>15. Responsibility Matrix</w:t>
+      </w:r>
+      <w:r>
+        <w:rPr>
+          <w:rFonts w:ascii="Calibri" w:hAnsi="Calibri"/>
+          <w:sz w:val="22"/>
+        </w:rPr>
+        <w:tab/>
+      </w:r>
+      <w:r>
+        <w:rPr>
+          <w:rFonts w:ascii="Calibri" w:hAnsi="Calibri"/>
+          <w:b/>
+          <w:sz w:val="22"/>
+        </w:rPr>
+        <w:t>20</w:t>
+      </w:r>
+    </w:p>
+    <w:p>
+      <w:r>
+        <w:br w:type="page"/>
+      </w:r>
+    </w:p>
+    <w:p>
+      <w:r>
+        <w:br w:type="page"/>
+      </w:r>
+    </w:p>
+    <w:p>
+      <w:pPr>
         <w:keepNext/>
-        <w:spacing w:before="720" w:after="120"/>
-        <w:jc w:val="center"/>
+        <w:spacing w:before="360" w:after="120"/>
       </w:pPr>
       <w:r>
         <w:rPr>
           <w:b/>
           <w:color w:val="1F497D"/>
-          <w:sz w:val="36"/>
-        </w:rPr>
-        <w:t>ISTANBUL HEALTH AND TECHNOLOGY UNIVERSITY</w:t>
-      </w:r>
-    </w:p>
-    <w:p>
-      <w:pPr>
-        <w:keepNext/>
-        <w:spacing w:before="240" w:after="120"/>
-        <w:jc w:val="center"/>
-      </w:pPr>
-      <w:r>
-        <w:rPr>
-          <w:b/>
-          <w:color w:val="595959"/>
-          <w:sz w:val="28"/>
-        </w:rPr>
-        <w:t>FACULTY OF ENGINEERING AND NATURAL SCIENCES</w:t>
-      </w:r>
-    </w:p>
-    <w:p>
-      <w:pPr>
-        <w:keepNext/>
-        <w:spacing w:before="240" w:after="120"/>
-        <w:jc w:val="center"/>
-      </w:pPr>
-      <w:r>
-        <w:rPr>
-          <w:b/>
-          <w:color w:val="595959"/>
-          <w:sz w:val="28"/>
-        </w:rPr>
-        <w:t>DEPARTMENT OF COMPUTER ENGINEERING</w:t>
-      </w:r>
-    </w:p>
-    <w:p>
-      <w:pPr>
-        <w:spacing w:before="0" w:after="80"/>
-      </w:pPr>
-    </w:p>
-    <w:p>
-      <w:pPr>
-        <w:spacing w:before="60" w:after="120" w:line="276" w:lineRule="auto"/>
-        <w:jc w:val="center"/>
-      </w:pPr>
-      <w:r>
-        <w:rPr>
-          <w:sz w:val="23"/>
-        </w:rPr>
-      </w:r>
-      <w:r>
-        <w:rPr>
-          <w:b/>
-          <w:sz w:val="23"/>
-        </w:rPr>
-        <w:t>2025 - 2026 ACADEMIC YEAR</w:t>
-      </w:r>
-      <w:r>
-        <w:rPr>
-          <w:sz w:val="23"/>
-        </w:rPr>
-        <w:t xml:space="preserve">  </w:t>
-      </w:r>
-    </w:p>
-    <w:p>
-      <w:pPr>
-        <w:spacing w:before="60" w:after="120" w:line="276" w:lineRule="auto"/>
-        <w:jc w:val="center"/>
-      </w:pPr>
-      <w:r>
-        <w:rPr>
-          <w:sz w:val="23"/>
-        </w:rPr>
-      </w:r>
-      <w:r>
-        <w:rPr>
-          <w:b/>
-          <w:sz w:val="23"/>
-        </w:rPr>
-        <w:t>3rd GRADE</w:t>
-      </w:r>
-      <w:r>
-        <w:rPr>
-          <w:sz w:val="23"/>
-        </w:rPr>
-      </w:r>
-    </w:p>
-    <w:p>
-      <w:pPr>
-        <w:spacing w:before="0" w:after="80"/>
-      </w:pPr>
-    </w:p>
-    <w:p>
-      <w:pPr>
-        <w:spacing w:before="0" w:after="80"/>
-      </w:pPr>
-    </w:p>
-    <w:p>
-      <w:pPr>
-        <w:keepNext/>
-        <w:spacing w:before="720" w:after="120"/>
-        <w:jc w:val="center"/>
-      </w:pPr>
-      <w:r>
-        <w:rPr>
-          <w:b/>
-          <w:color w:val="1F497D"/>
-          <w:sz w:val="36"/>
-        </w:rPr>
-        <w:t>SYSTEM PROGRAMMING</w:t>
-      </w:r>
-    </w:p>
-    <w:p>
-      <w:pPr>
-        <w:keepNext/>
-        <w:spacing w:before="240" w:after="120"/>
-        <w:jc w:val="center"/>
-      </w:pPr>
-      <w:r>
-        <w:rPr>
-          <w:b/>
-          <w:color w:val="595959"/>
-          <w:sz w:val="28"/>
-        </w:rPr>
-        <w:t>FINAL PROJECT REPORT: DESIGN AND IMPLEMENTATION OF A SIMPLE TWO-PASS COMPILER WITH INTERMEDIATE CODE GENERATION</w:t>
-      </w:r>
-    </w:p>
-    <w:p>
-      <w:pPr>
-        <w:spacing w:before="0" w:after="80"/>
-      </w:pPr>
-    </w:p>
-    <w:p>
-      <w:pPr>
-        <w:spacing w:before="0" w:after="80"/>
-      </w:pPr>
-    </w:p>
-    <w:p>
-      <w:pPr>
-        <w:keepNext/>
-        <w:spacing w:before="240" w:after="120"/>
-        <w:jc w:val="center"/>
-      </w:pPr>
-      <w:r>
-        <w:rPr>
-          <w:b/>
-          <w:color w:val="7F7F7F"/>
-          <w:sz w:val="24"/>
-        </w:rPr>
-        <w:t>Submitted by:</w:t>
-      </w:r>
-    </w:p>
-    <w:p>
-      <w:pPr>
-        <w:pStyle w:val="ListBullet"/>
-        <w:spacing w:before="40" w:after="40" w:line="276" w:lineRule="auto"/>
-      </w:pPr>
-      <w:r/>
-      <w:r>
-        <w:rPr>
-          <w:b/>
-        </w:rPr>
-        <w:t>Sercan Özkan</w:t>
-      </w:r>
-      <w:r>
-        <w:t xml:space="preserve"> | Student ID: </w:t>
-      </w:r>
-      <w:r>
-        <w:rPr>
-          <w:b/>
-        </w:rPr>
-        <w:t>220611005</w:t>
-      </w:r>
-      <w:r/>
-    </w:p>
-    <w:p>
-      <w:pPr>
-        <w:pStyle w:val="ListBullet"/>
-        <w:spacing w:before="40" w:after="40" w:line="276" w:lineRule="auto"/>
-      </w:pPr>
-      <w:r/>
-      <w:r>
-        <w:rPr>
-          <w:b/>
-        </w:rPr>
-        <w:t>Berat Kahraman</w:t>
-      </w:r>
-      <w:r>
-        <w:t xml:space="preserve"> | Student ID: </w:t>
-      </w:r>
-      <w:r>
-        <w:rPr>
-          <w:b/>
-        </w:rPr>
-        <w:t>220610038</w:t>
-      </w:r>
-      <w:r/>
-    </w:p>
-    <w:p>
-      <w:pPr>
-        <w:spacing w:before="0" w:after="80"/>
-      </w:pPr>
-    </w:p>
-    <w:p>
-      <w:pPr>
-        <w:keepNext/>
-        <w:spacing w:before="240" w:after="120"/>
-        <w:jc w:val="center"/>
-      </w:pPr>
-      <w:r>
-        <w:rPr>
-          <w:b/>
-          <w:color w:val="7F7F7F"/>
-          <w:sz w:val="24"/>
-        </w:rPr>
-        <w:t>Submitted to:</w:t>
-      </w:r>
-    </w:p>
-    <w:p>
-      <w:pPr>
-        <w:pStyle w:val="ListBullet"/>
-        <w:spacing w:before="40" w:after="40" w:line="276" w:lineRule="auto"/>
-      </w:pPr>
-      <w:r/>
-      <w:r>
-        <w:rPr>
-          <w:b/>
-        </w:rPr>
-        <w:t>Academic Course Faculty</w:t>
-      </w:r>
-      <w:r/>
-    </w:p>
-    <w:p>
-      <w:pPr>
-        <w:spacing w:before="0" w:after="80"/>
-      </w:pPr>
-    </w:p>
-    <w:p>
-      <w:pPr>
-        <w:spacing w:before="60" w:after="120" w:line="276" w:lineRule="auto"/>
-        <w:jc w:val="center"/>
-      </w:pPr>
-      <w:r>
-        <w:rPr>
-          <w:sz w:val="23"/>
-        </w:rPr>
-      </w:r>
-      <w:r>
-        <w:rPr>
-          <w:b/>
-          <w:sz w:val="23"/>
-        </w:rPr>
-        <w:t>Date of Submission:</w:t>
-      </w:r>
-      <w:r>
-        <w:rPr>
-          <w:sz w:val="23"/>
-        </w:rPr>
-        <w:t xml:space="preserve"> June 02, 2026  </w:t>
-      </w:r>
-    </w:p>
-    <w:p>
-      <w:pPr>
-        <w:spacing w:before="0" w:after="80"/>
-      </w:pPr>
-    </w:p>
-    <w:p>
-      <w:pPr>
-        <w:spacing w:before="0" w:after="80"/>
-      </w:pPr>
-    </w:p>
-    <w:p>
-      <w:pPr>
-        <w:keepNext/>
-        <w:spacing w:before="240" w:after="120"/>
-      </w:pPr>
-      <w:r>
-        <w:rPr>
-          <w:b/>
-          <w:color w:val="365F91"/>
-          <w:sz w:val="26"/>
-        </w:rPr>
-        <w:t>Table of Contents</w:t>
-      </w:r>
-    </w:p>
-    <w:p>
-      <w:pPr>
-        <w:spacing w:before="60" w:after="60" w:line="276" w:lineRule="auto"/>
-      </w:pPr>
-      <w:r>
-        <w:rPr>
-          <w:b/>
-        </w:rPr>
-        <w:t xml:space="preserve">1.  </w:t>
-      </w:r>
-      <w:r/>
-      <w:r>
-        <w:rPr>
-          <w:b/>
-        </w:rPr>
-        <w:t>Introduction</w:t>
-      </w:r>
-      <w:r/>
-    </w:p>
-    <w:p>
-      <w:pPr>
-        <w:spacing w:before="60" w:after="60" w:line="276" w:lineRule="auto"/>
-      </w:pPr>
-      <w:r>
-        <w:rPr>
-          <w:b/>
-        </w:rPr>
-        <w:t xml:space="preserve">2.  </w:t>
-      </w:r>
-      <w:r/>
-      <w:r>
-        <w:rPr>
-          <w:b/>
-        </w:rPr>
-        <w:t>Methodology</w:t>
-      </w:r>
-      <w:r/>
-    </w:p>
-    <w:p>
-      <w:pPr>
-        <w:spacing w:before="60" w:after="60" w:line="276" w:lineRule="auto"/>
-      </w:pPr>
-      <w:r>
-        <w:rPr>
-          <w:b/>
-        </w:rPr>
-        <w:t xml:space="preserve">3.  </w:t>
-      </w:r>
-      <w:r/>
-      <w:r>
-        <w:rPr>
-          <w:b/>
-        </w:rPr>
-        <w:t>Compiler Subsystem Architecture</w:t>
-      </w:r>
-      <w:r/>
-    </w:p>
-    <w:p>
-      <w:pPr>
-        <w:spacing w:before="60" w:after="60" w:line="276" w:lineRule="auto"/>
-      </w:pPr>
-      <w:r>
-        <w:rPr>
-          <w:b/>
-        </w:rPr>
-        <w:t xml:space="preserve">4.  </w:t>
-      </w:r>
-      <w:r/>
-      <w:r>
-        <w:rPr>
-          <w:b/>
-        </w:rPr>
-        <w:t>Source Language context-Free Grammar (CFG) &amp; BNF</w:t>
-      </w:r>
-      <w:r/>
-    </w:p>
-    <w:p>
-      <w:pPr>
-        <w:spacing w:before="60" w:after="60" w:line="276" w:lineRule="auto"/>
-      </w:pPr>
-      <w:r>
-        <w:rPr>
-          <w:b/>
-        </w:rPr>
-        <w:t xml:space="preserve">5.  </w:t>
-      </w:r>
-      <w:r/>
-      <w:r>
-        <w:rPr>
-          <w:b/>
-        </w:rPr>
-        <w:t>Pass 1: Lexical Analysis (Lexer) Design &amp; Implementation</w:t>
-      </w:r>
-      <w:r/>
-    </w:p>
-    <w:p>
-      <w:pPr>
-        <w:spacing w:before="60" w:after="60" w:line="276" w:lineRule="auto"/>
-      </w:pPr>
-      <w:r>
-        <w:rPr>
-          <w:b/>
-        </w:rPr>
-        <w:t xml:space="preserve">6.  </w:t>
-      </w:r>
-      <w:r/>
-      <w:r>
-        <w:rPr>
-          <w:b/>
-        </w:rPr>
-        <w:t>Pass 2: Syntax and Semantic Analysis (Parser) Design &amp; Implementation</w:t>
-      </w:r>
-      <w:r/>
-    </w:p>
-    <w:p>
-      <w:pPr>
-        <w:spacing w:before="60" w:after="60" w:line="276" w:lineRule="auto"/>
-      </w:pPr>
-      <w:r>
-        <w:rPr>
-          <w:b/>
-        </w:rPr>
-        <w:t xml:space="preserve">7.  </w:t>
-      </w:r>
-      <w:r/>
-      <w:r>
-        <w:rPr>
-          <w:b/>
-        </w:rPr>
-        <w:t>Symbol Table Stack &amp; Simulated Memory Management</w:t>
-      </w:r>
-      <w:r/>
-    </w:p>
-    <w:p>
-      <w:pPr>
-        <w:spacing w:before="60" w:after="60" w:line="276" w:lineRule="auto"/>
-      </w:pPr>
-      <w:r>
-        <w:rPr>
-          <w:b/>
-        </w:rPr>
-        <w:t xml:space="preserve">8.  </w:t>
-      </w:r>
-      <w:r/>
-      <w:r>
-        <w:rPr>
-          <w:b/>
-        </w:rPr>
-        <w:t>Static Semantics &amp; Type Checking System</w:t>
-      </w:r>
-      <w:r/>
-    </w:p>
-    <w:p>
-      <w:pPr>
-        <w:spacing w:before="60" w:after="60" w:line="276" w:lineRule="auto"/>
-      </w:pPr>
-      <w:r>
-        <w:rPr>
-          <w:b/>
-        </w:rPr>
-        <w:t xml:space="preserve">9.  </w:t>
-      </w:r>
-      <w:r/>
-      <w:r>
-        <w:rPr>
-          <w:b/>
-        </w:rPr>
-        <w:t>Intermediate Representation: Three-Address Code (TAC) Generation</w:t>
-      </w:r>
-      <w:r/>
-    </w:p>
-    <w:p>
-      <w:pPr>
-        <w:spacing w:before="60" w:after="60" w:line="276" w:lineRule="auto"/>
-      </w:pPr>
-      <w:r>
-        <w:rPr>
-          <w:b/>
-        </w:rPr>
-        <w:t xml:space="preserve">10.  </w:t>
-      </w:r>
-      <w:r/>
-      <w:r>
-        <w:rPr>
-          <w:b/>
-        </w:rPr>
-        <w:t>Error Handling &amp; Synchronization Recovery Strategy</w:t>
-      </w:r>
-      <w:r/>
-    </w:p>
-    <w:p>
-      <w:pPr>
-        <w:spacing w:before="60" w:after="60" w:line="276" w:lineRule="auto"/>
-      </w:pPr>
-      <w:r>
-        <w:rPr>
-          <w:b/>
-        </w:rPr>
-        <w:t xml:space="preserve">11.  </w:t>
-      </w:r>
-      <w:r/>
-      <w:r>
-        <w:rPr>
-          <w:b/>
-        </w:rPr>
-        <w:t>User Interface (UI) &amp; Integrated Development Environment (IDE) Walkthrough</w:t>
-      </w:r>
-      <w:r/>
-    </w:p>
-    <w:p>
-      <w:pPr>
-        <w:spacing w:before="60" w:after="60" w:line="276" w:lineRule="auto"/>
-      </w:pPr>
-      <w:r>
-        <w:rPr>
-          <w:b/>
-        </w:rPr>
-        <w:t xml:space="preserve">12.  </w:t>
-      </w:r>
-      <w:r/>
-      <w:r>
-        <w:rPr>
-          <w:b/>
-        </w:rPr>
-        <w:t>Challenges and Architectural Solutions</w:t>
-      </w:r>
-      <w:r/>
-    </w:p>
-    <w:p>
-      <w:pPr>
-        <w:spacing w:before="60" w:after="60" w:line="276" w:lineRule="auto"/>
-      </w:pPr>
-      <w:r>
-        <w:rPr>
-          <w:b/>
-        </w:rPr>
-        <w:t xml:space="preserve">13.  </w:t>
-      </w:r>
-      <w:r/>
-      <w:r>
-        <w:rPr>
-          <w:b/>
-        </w:rPr>
-        <w:t>Limitations and Future Work</w:t>
-      </w:r>
-      <w:r/>
-    </w:p>
-    <w:p>
-      <w:pPr>
-        <w:spacing w:before="60" w:after="60" w:line="276" w:lineRule="auto"/>
-      </w:pPr>
-      <w:r>
-        <w:rPr>
-          <w:b/>
-        </w:rPr>
-        <w:t xml:space="preserve">14.  </w:t>
-      </w:r>
-      <w:r/>
-      <w:r>
-        <w:rPr>
-          <w:b/>
-        </w:rPr>
-        <w:t>Conclusion</w:t>
-      </w:r>
-      <w:r/>
-    </w:p>
-    <w:p>
-      <w:pPr>
-        <w:spacing w:before="60" w:after="60" w:line="276" w:lineRule="auto"/>
-      </w:pPr>
-      <w:r>
-        <w:rPr>
-          <w:b/>
-        </w:rPr>
-        <w:t xml:space="preserve">15.  </w:t>
-      </w:r>
-      <w:r/>
-      <w:r>
-        <w:rPr>
-          <w:b/>
-        </w:rPr>
-        <w:t>Responsibility Matrix</w:t>
-      </w:r>
-      <w:r/>
-    </w:p>
-    <w:p>
-      <w:pPr>
-        <w:spacing w:before="0" w:after="80"/>
-      </w:pPr>
-    </w:p>
-    <w:p>
-      <w:pPr>
-        <w:spacing w:before="0" w:after="80"/>
-      </w:pPr>
-    </w:p>
-    <w:p>
-      <w:pPr>
-        <w:keepNext/>
-        <w:spacing w:before="240" w:after="120"/>
-      </w:pPr>
-      <w:r>
-        <w:rPr>
-          <w:b/>
-          <w:color w:val="365F91"/>
           <w:sz w:val="26"/>
         </w:rPr>
         <w:t>1. Introduction</w:t>
@@ -815,14 +927,19 @@
       </w:pPr>
     </w:p>
     <w:p>
+      <w:r>
+        <w:br w:type="page"/>
+      </w:r>
+    </w:p>
+    <w:p>
       <w:pPr>
         <w:keepNext/>
-        <w:spacing w:before="240" w:after="120"/>
+        <w:spacing w:before="360" w:after="120"/>
       </w:pPr>
       <w:r>
         <w:rPr>
           <w:b/>
-          <w:color w:val="365F91"/>
+          <w:color w:val="1F497D"/>
           <w:sz w:val="26"/>
         </w:rPr>
         <w:t>2. Methodology</w:t>
@@ -996,14 +1113,19 @@
       </w:pPr>
     </w:p>
     <w:p>
+      <w:r>
+        <w:br w:type="page"/>
+      </w:r>
+    </w:p>
+    <w:p>
       <w:pPr>
         <w:keepNext/>
-        <w:spacing w:before="240" w:after="120"/>
+        <w:spacing w:before="360" w:after="120"/>
       </w:pPr>
       <w:r>
         <w:rPr>
           <w:b/>
-          <w:color w:val="365F91"/>
+          <w:color w:val="1F497D"/>
           <w:sz w:val="26"/>
         </w:rPr>
         <w:t>3. Compiler Subsystem Architecture</w:t>
@@ -1563,14 +1685,19 @@
       </w:pPr>
     </w:p>
     <w:p>
+      <w:r>
+        <w:br w:type="page"/>
+      </w:r>
+    </w:p>
+    <w:p>
       <w:pPr>
         <w:keepNext/>
-        <w:spacing w:before="240" w:after="120"/>
+        <w:spacing w:before="360" w:after="120"/>
       </w:pPr>
       <w:r>
         <w:rPr>
           <w:b/>
-          <w:color w:val="365F91"/>
+          <w:color w:val="1F497D"/>
           <w:sz w:val="26"/>
         </w:rPr>
         <w:t>4. Source Language Context-Free Grammar (CFG) &amp; BNF</w:t>
@@ -1741,14 +1868,19 @@
       </w:pPr>
     </w:p>
     <w:p>
+      <w:r>
+        <w:br w:type="page"/>
+      </w:r>
+    </w:p>
+    <w:p>
       <w:pPr>
         <w:keepNext/>
-        <w:spacing w:before="240" w:after="120"/>
+        <w:spacing w:before="360" w:after="120"/>
       </w:pPr>
       <w:r>
         <w:rPr>
           <w:b/>
-          <w:color w:val="365F91"/>
+          <w:color w:val="1F497D"/>
           <w:sz w:val="26"/>
         </w:rPr>
         <w:t>5. Pass 1: Lexical Analysis (Lexer) Design &amp; Implementation</w:t>
@@ -2113,14 +2245,19 @@
       </w:pPr>
     </w:p>
     <w:p>
+      <w:r>
+        <w:br w:type="page"/>
+      </w:r>
+    </w:p>
+    <w:p>
       <w:pPr>
         <w:keepNext/>
-        <w:spacing w:before="240" w:after="120"/>
+        <w:spacing w:before="360" w:after="120"/>
       </w:pPr>
       <w:r>
         <w:rPr>
           <w:b/>
-          <w:color w:val="365F91"/>
+          <w:color w:val="1F497D"/>
           <w:sz w:val="26"/>
         </w:rPr>
         <w:t>6. Pass 2: Syntax and Semantic Analysis (Parser)</w:t>
@@ -2387,14 +2524,19 @@
       </w:pPr>
     </w:p>
     <w:p>
+      <w:r>
+        <w:br w:type="page"/>
+      </w:r>
+    </w:p>
+    <w:p>
       <w:pPr>
         <w:keepNext/>
-        <w:spacing w:before="240" w:after="120"/>
+        <w:spacing w:before="360" w:after="120"/>
       </w:pPr>
       <w:r>
         <w:rPr>
           <w:b/>
-          <w:color w:val="365F91"/>
+          <w:color w:val="1F497D"/>
           <w:sz w:val="26"/>
         </w:rPr>
         <w:t>7. Symbol Table Stack &amp; Simulated Memory Management</w:t>
@@ -3163,14 +3305,19 @@
       </w:pPr>
     </w:p>
     <w:p>
+      <w:r>
+        <w:br w:type="page"/>
+      </w:r>
+    </w:p>
+    <w:p>
       <w:pPr>
         <w:keepNext/>
-        <w:spacing w:before="240" w:after="120"/>
+        <w:spacing w:before="360" w:after="120"/>
       </w:pPr>
       <w:r>
         <w:rPr>
           <w:b/>
-          <w:color w:val="365F91"/>
+          <w:color w:val="1F497D"/>
           <w:sz w:val="26"/>
         </w:rPr>
         <w:t>8. Static Semantics &amp; Type Checking System</w:t>
@@ -3442,14 +3589,19 @@
       </w:pPr>
     </w:p>
     <w:p>
+      <w:r>
+        <w:br w:type="page"/>
+      </w:r>
+    </w:p>
+    <w:p>
       <w:pPr>
         <w:keepNext/>
-        <w:spacing w:before="240" w:after="120"/>
+        <w:spacing w:before="360" w:after="120"/>
       </w:pPr>
       <w:r>
         <w:rPr>
           <w:b/>
-          <w:color w:val="365F91"/>
+          <w:color w:val="1F497D"/>
           <w:sz w:val="26"/>
         </w:rPr>
         <w:t>9. Intermediate Representation: Three-Address Code (TAC) Generation</w:t>
@@ -3792,14 +3944,19 @@
       </w:pPr>
     </w:p>
     <w:p>
+      <w:r>
+        <w:br w:type="page"/>
+      </w:r>
+    </w:p>
+    <w:p>
       <w:pPr>
         <w:keepNext/>
-        <w:spacing w:before="240" w:after="120"/>
+        <w:spacing w:before="360" w:after="120"/>
       </w:pPr>
       <w:r>
         <w:rPr>
           <w:b/>
-          <w:color w:val="365F91"/>
+          <w:color w:val="1F497D"/>
           <w:sz w:val="26"/>
         </w:rPr>
         <w:t>10. Error Handling &amp; Synchronization Recovery Strategy</w:t>
@@ -3971,14 +4128,19 @@
       </w:pPr>
     </w:p>
     <w:p>
+      <w:r>
+        <w:br w:type="page"/>
+      </w:r>
+    </w:p>
+    <w:p>
       <w:pPr>
         <w:keepNext/>
-        <w:spacing w:before="240" w:after="120"/>
+        <w:spacing w:before="360" w:after="120"/>
       </w:pPr>
       <w:r>
         <w:rPr>
           <w:b/>
-          <w:color w:val="365F91"/>
+          <w:color w:val="1F497D"/>
           <w:sz w:val="26"/>
         </w:rPr>
         <w:t>11. User Interface (UI) &amp; Integrated Development Environment (IDE) Walkthrough</w:t>
@@ -4277,14 +4439,19 @@
       </w:pPr>
     </w:p>
     <w:p>
+      <w:r>
+        <w:br w:type="page"/>
+      </w:r>
+    </w:p>
+    <w:p>
       <w:pPr>
         <w:keepNext/>
-        <w:spacing w:before="240" w:after="120"/>
+        <w:spacing w:before="360" w:after="120"/>
       </w:pPr>
       <w:r>
         <w:rPr>
           <w:b/>
-          <w:color w:val="365F91"/>
+          <w:color w:val="1F497D"/>
           <w:sz w:val="26"/>
         </w:rPr>
         <w:t>12. Challenges and Architectural Solutions</w:t>
@@ -4406,14 +4573,19 @@
       </w:pPr>
     </w:p>
     <w:p>
+      <w:r>
+        <w:br w:type="page"/>
+      </w:r>
+    </w:p>
+    <w:p>
       <w:pPr>
         <w:keepNext/>
-        <w:spacing w:before="240" w:after="120"/>
+        <w:spacing w:before="360" w:after="120"/>
       </w:pPr>
       <w:r>
         <w:rPr>
           <w:b/>
-          <w:color w:val="365F91"/>
+          <w:color w:val="1F497D"/>
           <w:sz w:val="26"/>
         </w:rPr>
         <w:t>13. Limitations and Future Work</w:t>
@@ -4503,14 +4675,19 @@
       </w:pPr>
     </w:p>
     <w:p>
+      <w:r>
+        <w:br w:type="page"/>
+      </w:r>
+    </w:p>
+    <w:p>
       <w:pPr>
         <w:keepNext/>
-        <w:spacing w:before="240" w:after="120"/>
+        <w:spacing w:before="360" w:after="120"/>
       </w:pPr>
       <w:r>
         <w:rPr>
           <w:b/>
-          <w:color w:val="365F91"/>
+          <w:color w:val="1F497D"/>
           <w:sz w:val="26"/>
         </w:rPr>
         <w:t>14. Conclusion</w:t>
@@ -4620,14 +4797,19 @@
       </w:pPr>
     </w:p>
     <w:p>
+      <w:r>
+        <w:br w:type="page"/>
+      </w:r>
+    </w:p>
+    <w:p>
       <w:pPr>
         <w:keepNext/>
-        <w:spacing w:before="240" w:after="120"/>
+        <w:spacing w:before="360" w:after="120"/>
       </w:pPr>
       <w:r>
         <w:rPr>
           <w:b/>
-          <w:color w:val="365F91"/>
+          <w:color w:val="1F497D"/>
           <w:sz w:val="26"/>
         </w:rPr>
         <w:t>15. Responsibility Matrix</w:t>

</xml_diff>

<commit_message>
Fix TAC scope shadowing in compiler engine, insert UI screenshots into project report
</commit_message>
<xml_diff>
--- a/Compiler_Design_Project_Report.docx
+++ b/Compiler_Design_Project_Report.docx
@@ -4435,6 +4435,218 @@
     </w:p>
     <w:p>
       <w:pPr>
+        <w:keepNext/>
+        <w:spacing w:before="240" w:after="120"/>
+      </w:pPr>
+      <w:r>
+        <w:rPr>
+          <w:b/>
+          <w:color w:val="222222"/>
+          <w:sz w:val="23"/>
+        </w:rPr>
+        <w:t>11.1 Compiler Application Dashboard Screenshots</w:t>
+      </w:r>
+    </w:p>
+    <w:p>
+      <w:pPr>
+        <w:spacing w:before="0" w:after="80"/>
+      </w:pPr>
+    </w:p>
+    <w:p>
+      <w:pPr>
+        <w:spacing w:before="60" w:after="120" w:line="276" w:lineRule="auto"/>
+      </w:pPr>
+      <w:r>
+        <w:t>The following screenshots demonstrate the integrated compiler app (`COMPILER.EXE`) running within the Holo-Cyber OS desktop:</w:t>
+      </w:r>
+    </w:p>
+    <w:p>
+      <w:pPr>
+        <w:spacing w:before="0" w:after="80"/>
+      </w:pPr>
+    </w:p>
+    <w:p>
+      <w:pPr>
+        <w:spacing w:before="240" w:after="80"/>
+        <w:jc w:val="center"/>
+      </w:pPr>
+      <w:r>
+        <w:drawing>
+          <wp:inline xmlns:a="http://schemas.openxmlformats.org/drawingml/2006/main" xmlns:pic="http://schemas.openxmlformats.org/drawingml/2006/picture">
+            <wp:extent cx="5029200" cy="5029200"/>
+            <wp:docPr id="2" name="Picture 2"/>
+            <wp:cNvGraphicFramePr>
+              <a:graphicFrameLocks noChangeAspect="1"/>
+            </wp:cNvGraphicFramePr>
+            <a:graphic>
+              <a:graphicData uri="http://schemas.openxmlformats.org/drawingml/2006/picture">
+                <pic:pic>
+                  <pic:nvPicPr>
+                    <pic:cNvPr id="0" name="compiler_lexer_screenshot.png"/>
+                    <pic:cNvPicPr/>
+                  </pic:nvPicPr>
+                  <pic:blipFill>
+                    <a:blip r:embed="rId10"/>
+                    <a:stretch>
+                      <a:fillRect/>
+                    </a:stretch>
+                  </pic:blipFill>
+                  <pic:spPr>
+                    <a:xfrm>
+                      <a:off x="0" y="0"/>
+                      <a:ext cx="5029200" cy="5029200"/>
+                    </a:xfrm>
+                    <a:prstGeom prst="rect"/>
+                  </pic:spPr>
+                </pic:pic>
+              </a:graphicData>
+            </a:graphic>
+          </wp:inline>
+        </w:drawing>
+      </w:r>
+    </w:p>
+    <w:p>
+      <w:pPr>
+        <w:spacing w:before="40" w:after="240"/>
+        <w:jc w:val="center"/>
+      </w:pPr>
+      <w:r>
+        <w:rPr>
+          <w:rFonts w:ascii="Calibri" w:hAnsi="Calibri"/>
+          <w:i/>
+          <w:color w:val="595959"/>
+          <w:sz w:val="19"/>
+        </w:rPr>
+        <w:t>Figure: Lexer Token Stream Panel</w:t>
+      </w:r>
+    </w:p>
+    <w:p>
+      <w:pPr>
+        <w:spacing w:before="0" w:after="80"/>
+      </w:pPr>
+    </w:p>
+    <w:p>
+      <w:pPr>
+        <w:spacing w:before="240" w:after="80"/>
+        <w:jc w:val="center"/>
+      </w:pPr>
+      <w:r>
+        <w:drawing>
+          <wp:inline xmlns:a="http://schemas.openxmlformats.org/drawingml/2006/main" xmlns:pic="http://schemas.openxmlformats.org/drawingml/2006/picture">
+            <wp:extent cx="5029200" cy="5029200"/>
+            <wp:docPr id="3" name="Picture 3"/>
+            <wp:cNvGraphicFramePr>
+              <a:graphicFrameLocks noChangeAspect="1"/>
+            </wp:cNvGraphicFramePr>
+            <a:graphic>
+              <a:graphicData uri="http://schemas.openxmlformats.org/drawingml/2006/picture">
+                <pic:pic>
+                  <pic:nvPicPr>
+                    <pic:cNvPr id="0" name="compiler_ast_screenshot.png"/>
+                    <pic:cNvPicPr/>
+                  </pic:nvPicPr>
+                  <pic:blipFill>
+                    <a:blip r:embed="rId11"/>
+                    <a:stretch>
+                      <a:fillRect/>
+                    </a:stretch>
+                  </pic:blipFill>
+                  <pic:spPr>
+                    <a:xfrm>
+                      <a:off x="0" y="0"/>
+                      <a:ext cx="5029200" cy="5029200"/>
+                    </a:xfrm>
+                    <a:prstGeom prst="rect"/>
+                  </pic:spPr>
+                </pic:pic>
+              </a:graphicData>
+            </a:graphic>
+          </wp:inline>
+        </w:drawing>
+      </w:r>
+    </w:p>
+    <w:p>
+      <w:pPr>
+        <w:spacing w:before="40" w:after="240"/>
+        <w:jc w:val="center"/>
+      </w:pPr>
+      <w:r>
+        <w:rPr>
+          <w:rFonts w:ascii="Calibri" w:hAnsi="Calibri"/>
+          <w:i/>
+          <w:color w:val="595959"/>
+          <w:sz w:val="19"/>
+        </w:rPr>
+        <w:t>Figure: Abstract Syntax Tree (AST) Tab Panel</w:t>
+      </w:r>
+    </w:p>
+    <w:p>
+      <w:pPr>
+        <w:spacing w:before="0" w:after="80"/>
+      </w:pPr>
+    </w:p>
+    <w:p>
+      <w:pPr>
+        <w:spacing w:before="240" w:after="80"/>
+        <w:jc w:val="center"/>
+      </w:pPr>
+      <w:r>
+        <w:drawing>
+          <wp:inline xmlns:a="http://schemas.openxmlformats.org/drawingml/2006/main" xmlns:pic="http://schemas.openxmlformats.org/drawingml/2006/picture">
+            <wp:extent cx="5029200" cy="5029200"/>
+            <wp:docPr id="4" name="Picture 4"/>
+            <wp:cNvGraphicFramePr>
+              <a:graphicFrameLocks noChangeAspect="1"/>
+            </wp:cNvGraphicFramePr>
+            <a:graphic>
+              <a:graphicData uri="http://schemas.openxmlformats.org/drawingml/2006/picture">
+                <pic:pic>
+                  <pic:nvPicPr>
+                    <pic:cNvPr id="0" name="compiler_diags_screenshot.png"/>
+                    <pic:cNvPicPr/>
+                  </pic:nvPicPr>
+                  <pic:blipFill>
+                    <a:blip r:embed="rId12"/>
+                    <a:stretch>
+                      <a:fillRect/>
+                    </a:stretch>
+                  </pic:blipFill>
+                  <pic:spPr>
+                    <a:xfrm>
+                      <a:off x="0" y="0"/>
+                      <a:ext cx="5029200" cy="5029200"/>
+                    </a:xfrm>
+                    <a:prstGeom prst="rect"/>
+                  </pic:spPr>
+                </pic:pic>
+              </a:graphicData>
+            </a:graphic>
+          </wp:inline>
+        </w:drawing>
+      </w:r>
+    </w:p>
+    <w:p>
+      <w:pPr>
+        <w:spacing w:before="40" w:after="240"/>
+        <w:jc w:val="center"/>
+      </w:pPr>
+      <w:r>
+        <w:rPr>
+          <w:rFonts w:ascii="Calibri" w:hAnsi="Calibri"/>
+          <w:i/>
+          <w:color w:val="595959"/>
+          <w:sz w:val="19"/>
+        </w:rPr>
+        <w:t>Figure: Diagnostics Panel with Syntax Errors Highlighted</w:t>
+      </w:r>
+    </w:p>
+    <w:p>
+      <w:pPr>
+        <w:spacing w:before="0" w:after="80"/>
+      </w:pPr>
+    </w:p>
+    <w:p>
+      <w:pPr>
         <w:spacing w:before="0" w:after="80"/>
       </w:pPr>
     </w:p>

</xml_diff>

<commit_message>
Insert actual user screenshots (lexer1-4, ast1-3, diag1-2) into the project report
</commit_message>
<xml_diff>
--- a/Compiler_Design_Project_Report.docx
+++ b/Compiler_Design_Project_Report.docx
@@ -4467,13 +4467,26 @@
     </w:p>
     <w:p>
       <w:pPr>
+        <w:keepNext/>
+        <w:spacing w:before="240" w:after="120"/>
+      </w:pPr>
+      <w:r>
+        <w:rPr>
+          <w:i/>
+          <w:sz w:val="22"/>
+        </w:rPr>
+        <w:t>11.1.1 Lexical Analyzer (Lexer) Token Stream Visualizations</w:t>
+      </w:r>
+    </w:p>
+    <w:p>
+      <w:pPr>
         <w:spacing w:before="240" w:after="80"/>
         <w:jc w:val="center"/>
       </w:pPr>
       <w:r>
         <w:drawing>
           <wp:inline xmlns:a="http://schemas.openxmlformats.org/drawingml/2006/main" xmlns:pic="http://schemas.openxmlformats.org/drawingml/2006/picture">
-            <wp:extent cx="5029200" cy="5029200"/>
+            <wp:extent cx="5029200" cy="2670565"/>
             <wp:docPr id="2" name="Picture 2"/>
             <wp:cNvGraphicFramePr>
               <a:graphicFrameLocks noChangeAspect="1"/>
@@ -4482,7 +4495,7 @@
               <a:graphicData uri="http://schemas.openxmlformats.org/drawingml/2006/picture">
                 <pic:pic>
                   <pic:nvPicPr>
-                    <pic:cNvPr id="0" name="compiler_lexer_screenshot.png"/>
+                    <pic:cNvPr id="0" name="lexer1.png"/>
                     <pic:cNvPicPr/>
                   </pic:nvPicPr>
                   <pic:blipFill>
@@ -4494,7 +4507,7 @@
                   <pic:spPr>
                     <a:xfrm>
                       <a:off x="0" y="0"/>
-                      <a:ext cx="5029200" cy="5029200"/>
+                      <a:ext cx="5029200" cy="2670565"/>
                     </a:xfrm>
                     <a:prstGeom prst="rect"/>
                   </pic:spPr>
@@ -4517,13 +4530,8 @@
           <w:color w:val="595959"/>
           <w:sz w:val="19"/>
         </w:rPr>
-        <w:t>Figure: Lexer Token Stream Panel</w:t>
-      </w:r>
-    </w:p>
-    <w:p>
-      <w:pPr>
-        <w:spacing w:before="0" w:after="80"/>
-      </w:pPr>
+        <w:t>Figure: Lexer Stream Sample 1</w:t>
+      </w:r>
     </w:p>
     <w:p>
       <w:pPr>
@@ -4533,7 +4541,7 @@
       <w:r>
         <w:drawing>
           <wp:inline xmlns:a="http://schemas.openxmlformats.org/drawingml/2006/main" xmlns:pic="http://schemas.openxmlformats.org/drawingml/2006/picture">
-            <wp:extent cx="5029200" cy="5029200"/>
+            <wp:extent cx="5029200" cy="2651561"/>
             <wp:docPr id="3" name="Picture 3"/>
             <wp:cNvGraphicFramePr>
               <a:graphicFrameLocks noChangeAspect="1"/>
@@ -4542,7 +4550,7 @@
               <a:graphicData uri="http://schemas.openxmlformats.org/drawingml/2006/picture">
                 <pic:pic>
                   <pic:nvPicPr>
-                    <pic:cNvPr id="0" name="compiler_ast_screenshot.png"/>
+                    <pic:cNvPr id="0" name="lexer2.png"/>
                     <pic:cNvPicPr/>
                   </pic:nvPicPr>
                   <pic:blipFill>
@@ -4554,7 +4562,7 @@
                   <pic:spPr>
                     <a:xfrm>
                       <a:off x="0" y="0"/>
-                      <a:ext cx="5029200" cy="5029200"/>
+                      <a:ext cx="5029200" cy="2651561"/>
                     </a:xfrm>
                     <a:prstGeom prst="rect"/>
                   </pic:spPr>
@@ -4577,13 +4585,8 @@
           <w:color w:val="595959"/>
           <w:sz w:val="19"/>
         </w:rPr>
-        <w:t>Figure: Abstract Syntax Tree (AST) Tab Panel</w:t>
-      </w:r>
-    </w:p>
-    <w:p>
-      <w:pPr>
-        <w:spacing w:before="0" w:after="80"/>
-      </w:pPr>
+        <w:t>Figure: Lexer Stream Sample 2</w:t>
+      </w:r>
     </w:p>
     <w:p>
       <w:pPr>
@@ -4593,7 +4596,7 @@
       <w:r>
         <w:drawing>
           <wp:inline xmlns:a="http://schemas.openxmlformats.org/drawingml/2006/main" xmlns:pic="http://schemas.openxmlformats.org/drawingml/2006/picture">
-            <wp:extent cx="5029200" cy="5029200"/>
+            <wp:extent cx="5029200" cy="2668331"/>
             <wp:docPr id="4" name="Picture 4"/>
             <wp:cNvGraphicFramePr>
               <a:graphicFrameLocks noChangeAspect="1"/>
@@ -4602,7 +4605,7 @@
               <a:graphicData uri="http://schemas.openxmlformats.org/drawingml/2006/picture">
                 <pic:pic>
                   <pic:nvPicPr>
-                    <pic:cNvPr id="0" name="compiler_diags_screenshot.png"/>
+                    <pic:cNvPr id="0" name="lexer3.png"/>
                     <pic:cNvPicPr/>
                   </pic:nvPicPr>
                   <pic:blipFill>
@@ -4614,7 +4617,7 @@
                   <pic:spPr>
                     <a:xfrm>
                       <a:off x="0" y="0"/>
-                      <a:ext cx="5029200" cy="5029200"/>
+                      <a:ext cx="5029200" cy="2668331"/>
                     </a:xfrm>
                     <a:prstGeom prst="rect"/>
                   </pic:spPr>
@@ -4637,7 +4640,373 @@
           <w:color w:val="595959"/>
           <w:sz w:val="19"/>
         </w:rPr>
-        <w:t>Figure: Diagnostics Panel with Syntax Errors Highlighted</w:t>
+        <w:t>Figure: Lexer Stream Sample 3</w:t>
+      </w:r>
+    </w:p>
+    <w:p>
+      <w:pPr>
+        <w:spacing w:before="240" w:after="80"/>
+        <w:jc w:val="center"/>
+      </w:pPr>
+      <w:r>
+        <w:drawing>
+          <wp:inline xmlns:a="http://schemas.openxmlformats.org/drawingml/2006/main" xmlns:pic="http://schemas.openxmlformats.org/drawingml/2006/picture">
+            <wp:extent cx="5029200" cy="2772648"/>
+            <wp:docPr id="5" name="Picture 5"/>
+            <wp:cNvGraphicFramePr>
+              <a:graphicFrameLocks noChangeAspect="1"/>
+            </wp:cNvGraphicFramePr>
+            <a:graphic>
+              <a:graphicData uri="http://schemas.openxmlformats.org/drawingml/2006/picture">
+                <pic:pic>
+                  <pic:nvPicPr>
+                    <pic:cNvPr id="0" name="lexer4.png"/>
+                    <pic:cNvPicPr/>
+                  </pic:nvPicPr>
+                  <pic:blipFill>
+                    <a:blip r:embed="rId13"/>
+                    <a:stretch>
+                      <a:fillRect/>
+                    </a:stretch>
+                  </pic:blipFill>
+                  <pic:spPr>
+                    <a:xfrm>
+                      <a:off x="0" y="0"/>
+                      <a:ext cx="5029200" cy="2772648"/>
+                    </a:xfrm>
+                    <a:prstGeom prst="rect"/>
+                  </pic:spPr>
+                </pic:pic>
+              </a:graphicData>
+            </a:graphic>
+          </wp:inline>
+        </w:drawing>
+      </w:r>
+    </w:p>
+    <w:p>
+      <w:pPr>
+        <w:spacing w:before="40" w:after="240"/>
+        <w:jc w:val="center"/>
+      </w:pPr>
+      <w:r>
+        <w:rPr>
+          <w:rFonts w:ascii="Calibri" w:hAnsi="Calibri"/>
+          <w:i/>
+          <w:color w:val="595959"/>
+          <w:sz w:val="19"/>
+        </w:rPr>
+        <w:t>Figure: Lexer Stream Sample 4</w:t>
+      </w:r>
+    </w:p>
+    <w:p>
+      <w:pPr>
+        <w:spacing w:before="0" w:after="80"/>
+      </w:pPr>
+    </w:p>
+    <w:p>
+      <w:pPr>
+        <w:keepNext/>
+        <w:spacing w:before="240" w:after="120"/>
+      </w:pPr>
+      <w:r>
+        <w:rPr>
+          <w:i/>
+          <w:sz w:val="22"/>
+        </w:rPr>
+        <w:t>11.1.2 Abstract Syntax Tree (AST) Tab Visualizations</w:t>
+      </w:r>
+    </w:p>
+    <w:p>
+      <w:pPr>
+        <w:spacing w:before="240" w:after="80"/>
+        <w:jc w:val="center"/>
+      </w:pPr>
+      <w:r>
+        <w:drawing>
+          <wp:inline xmlns:a="http://schemas.openxmlformats.org/drawingml/2006/main" xmlns:pic="http://schemas.openxmlformats.org/drawingml/2006/picture">
+            <wp:extent cx="5029200" cy="2547399"/>
+            <wp:docPr id="6" name="Picture 6"/>
+            <wp:cNvGraphicFramePr>
+              <a:graphicFrameLocks noChangeAspect="1"/>
+            </wp:cNvGraphicFramePr>
+            <a:graphic>
+              <a:graphicData uri="http://schemas.openxmlformats.org/drawingml/2006/picture">
+                <pic:pic>
+                  <pic:nvPicPr>
+                    <pic:cNvPr id="0" name="ast1.png"/>
+                    <pic:cNvPicPr/>
+                  </pic:nvPicPr>
+                  <pic:blipFill>
+                    <a:blip r:embed="rId14"/>
+                    <a:stretch>
+                      <a:fillRect/>
+                    </a:stretch>
+                  </pic:blipFill>
+                  <pic:spPr>
+                    <a:xfrm>
+                      <a:off x="0" y="0"/>
+                      <a:ext cx="5029200" cy="2547399"/>
+                    </a:xfrm>
+                    <a:prstGeom prst="rect"/>
+                  </pic:spPr>
+                </pic:pic>
+              </a:graphicData>
+            </a:graphic>
+          </wp:inline>
+        </w:drawing>
+      </w:r>
+    </w:p>
+    <w:p>
+      <w:pPr>
+        <w:spacing w:before="40" w:after="240"/>
+        <w:jc w:val="center"/>
+      </w:pPr>
+      <w:r>
+        <w:rPr>
+          <w:rFonts w:ascii="Calibri" w:hAnsi="Calibri"/>
+          <w:i/>
+          <w:color w:val="595959"/>
+          <w:sz w:val="19"/>
+        </w:rPr>
+        <w:t>Figure: AST Hierarchy Visual 1</w:t>
+      </w:r>
+    </w:p>
+    <w:p>
+      <w:pPr>
+        <w:spacing w:before="240" w:after="80"/>
+        <w:jc w:val="center"/>
+      </w:pPr>
+      <w:r>
+        <w:drawing>
+          <wp:inline xmlns:a="http://schemas.openxmlformats.org/drawingml/2006/main" xmlns:pic="http://schemas.openxmlformats.org/drawingml/2006/picture">
+            <wp:extent cx="5029200" cy="2249185"/>
+            <wp:docPr id="7" name="Picture 7"/>
+            <wp:cNvGraphicFramePr>
+              <a:graphicFrameLocks noChangeAspect="1"/>
+            </wp:cNvGraphicFramePr>
+            <a:graphic>
+              <a:graphicData uri="http://schemas.openxmlformats.org/drawingml/2006/picture">
+                <pic:pic>
+                  <pic:nvPicPr>
+                    <pic:cNvPr id="0" name="ast2.png"/>
+                    <pic:cNvPicPr/>
+                  </pic:nvPicPr>
+                  <pic:blipFill>
+                    <a:blip r:embed="rId15"/>
+                    <a:stretch>
+                      <a:fillRect/>
+                    </a:stretch>
+                  </pic:blipFill>
+                  <pic:spPr>
+                    <a:xfrm>
+                      <a:off x="0" y="0"/>
+                      <a:ext cx="5029200" cy="2249185"/>
+                    </a:xfrm>
+                    <a:prstGeom prst="rect"/>
+                  </pic:spPr>
+                </pic:pic>
+              </a:graphicData>
+            </a:graphic>
+          </wp:inline>
+        </w:drawing>
+      </w:r>
+    </w:p>
+    <w:p>
+      <w:pPr>
+        <w:spacing w:before="40" w:after="240"/>
+        <w:jc w:val="center"/>
+      </w:pPr>
+      <w:r>
+        <w:rPr>
+          <w:rFonts w:ascii="Calibri" w:hAnsi="Calibri"/>
+          <w:i/>
+          <w:color w:val="595959"/>
+          <w:sz w:val="19"/>
+        </w:rPr>
+        <w:t>Figure: AST Hierarchy Visual 2</w:t>
+      </w:r>
+    </w:p>
+    <w:p>
+      <w:pPr>
+        <w:spacing w:before="240" w:after="80"/>
+        <w:jc w:val="center"/>
+      </w:pPr>
+      <w:r>
+        <w:drawing>
+          <wp:inline xmlns:a="http://schemas.openxmlformats.org/drawingml/2006/main" xmlns:pic="http://schemas.openxmlformats.org/drawingml/2006/picture">
+            <wp:extent cx="5029200" cy="2806228"/>
+            <wp:docPr id="8" name="Picture 8"/>
+            <wp:cNvGraphicFramePr>
+              <a:graphicFrameLocks noChangeAspect="1"/>
+            </wp:cNvGraphicFramePr>
+            <a:graphic>
+              <a:graphicData uri="http://schemas.openxmlformats.org/drawingml/2006/picture">
+                <pic:pic>
+                  <pic:nvPicPr>
+                    <pic:cNvPr id="0" name="ast3.png"/>
+                    <pic:cNvPicPr/>
+                  </pic:nvPicPr>
+                  <pic:blipFill>
+                    <a:blip r:embed="rId16"/>
+                    <a:stretch>
+                      <a:fillRect/>
+                    </a:stretch>
+                  </pic:blipFill>
+                  <pic:spPr>
+                    <a:xfrm>
+                      <a:off x="0" y="0"/>
+                      <a:ext cx="5029200" cy="2806228"/>
+                    </a:xfrm>
+                    <a:prstGeom prst="rect"/>
+                  </pic:spPr>
+                </pic:pic>
+              </a:graphicData>
+            </a:graphic>
+          </wp:inline>
+        </w:drawing>
+      </w:r>
+    </w:p>
+    <w:p>
+      <w:pPr>
+        <w:spacing w:before="40" w:after="240"/>
+        <w:jc w:val="center"/>
+      </w:pPr>
+      <w:r>
+        <w:rPr>
+          <w:rFonts w:ascii="Calibri" w:hAnsi="Calibri"/>
+          <w:i/>
+          <w:color w:val="595959"/>
+          <w:sz w:val="19"/>
+        </w:rPr>
+        <w:t>Figure: AST Hierarchy Visual 3</w:t>
+      </w:r>
+    </w:p>
+    <w:p>
+      <w:pPr>
+        <w:spacing w:before="0" w:after="80"/>
+      </w:pPr>
+    </w:p>
+    <w:p>
+      <w:pPr>
+        <w:keepNext/>
+        <w:spacing w:before="240" w:after="120"/>
+      </w:pPr>
+      <w:r>
+        <w:rPr>
+          <w:i/>
+          <w:sz w:val="22"/>
+        </w:rPr>
+        <w:t>11.1.3 Diagnostics Panel (Syntax &amp; Semantic Error Warnings)</w:t>
+      </w:r>
+    </w:p>
+    <w:p>
+      <w:pPr>
+        <w:spacing w:before="240" w:after="80"/>
+        <w:jc w:val="center"/>
+      </w:pPr>
+      <w:r>
+        <w:drawing>
+          <wp:inline xmlns:a="http://schemas.openxmlformats.org/drawingml/2006/main" xmlns:pic="http://schemas.openxmlformats.org/drawingml/2006/picture">
+            <wp:extent cx="5029200" cy="2763057"/>
+            <wp:docPr id="9" name="Picture 9"/>
+            <wp:cNvGraphicFramePr>
+              <a:graphicFrameLocks noChangeAspect="1"/>
+            </wp:cNvGraphicFramePr>
+            <a:graphic>
+              <a:graphicData uri="http://schemas.openxmlformats.org/drawingml/2006/picture">
+                <pic:pic>
+                  <pic:nvPicPr>
+                    <pic:cNvPr id="0" name="diag1.png"/>
+                    <pic:cNvPicPr/>
+                  </pic:nvPicPr>
+                  <pic:blipFill>
+                    <a:blip r:embed="rId17"/>
+                    <a:stretch>
+                      <a:fillRect/>
+                    </a:stretch>
+                  </pic:blipFill>
+                  <pic:spPr>
+                    <a:xfrm>
+                      <a:off x="0" y="0"/>
+                      <a:ext cx="5029200" cy="2763057"/>
+                    </a:xfrm>
+                    <a:prstGeom prst="rect"/>
+                  </pic:spPr>
+                </pic:pic>
+              </a:graphicData>
+            </a:graphic>
+          </wp:inline>
+        </w:drawing>
+      </w:r>
+    </w:p>
+    <w:p>
+      <w:pPr>
+        <w:spacing w:before="40" w:after="240"/>
+        <w:jc w:val="center"/>
+      </w:pPr>
+      <w:r>
+        <w:rPr>
+          <w:rFonts w:ascii="Calibri" w:hAnsi="Calibri"/>
+          <w:i/>
+          <w:color w:val="595959"/>
+          <w:sz w:val="19"/>
+        </w:rPr>
+        <w:t>Figure: Compiler Error Warnings Sample 1</w:t>
+      </w:r>
+    </w:p>
+    <w:p>
+      <w:pPr>
+        <w:spacing w:before="240" w:after="80"/>
+        <w:jc w:val="center"/>
+      </w:pPr>
+      <w:r>
+        <w:drawing>
+          <wp:inline xmlns:a="http://schemas.openxmlformats.org/drawingml/2006/main" xmlns:pic="http://schemas.openxmlformats.org/drawingml/2006/picture">
+            <wp:extent cx="5029200" cy="2263140"/>
+            <wp:docPr id="10" name="Picture 10"/>
+            <wp:cNvGraphicFramePr>
+              <a:graphicFrameLocks noChangeAspect="1"/>
+            </wp:cNvGraphicFramePr>
+            <a:graphic>
+              <a:graphicData uri="http://schemas.openxmlformats.org/drawingml/2006/picture">
+                <pic:pic>
+                  <pic:nvPicPr>
+                    <pic:cNvPr id="0" name="diag2.png"/>
+                    <pic:cNvPicPr/>
+                  </pic:nvPicPr>
+                  <pic:blipFill>
+                    <a:blip r:embed="rId18"/>
+                    <a:stretch>
+                      <a:fillRect/>
+                    </a:stretch>
+                  </pic:blipFill>
+                  <pic:spPr>
+                    <a:xfrm>
+                      <a:off x="0" y="0"/>
+                      <a:ext cx="5029200" cy="2263140"/>
+                    </a:xfrm>
+                    <a:prstGeom prst="rect"/>
+                  </pic:spPr>
+                </pic:pic>
+              </a:graphicData>
+            </a:graphic>
+          </wp:inline>
+        </w:drawing>
+      </w:r>
+    </w:p>
+    <w:p>
+      <w:pPr>
+        <w:spacing w:before="40" w:after="240"/>
+        <w:jc w:val="center"/>
+      </w:pPr>
+      <w:r>
+        <w:rPr>
+          <w:rFonts w:ascii="Calibri" w:hAnsi="Calibri"/>
+          <w:i/>
+          <w:color w:val="595959"/>
+          <w:sz w:val="19"/>
+        </w:rPr>
+        <w:t>Figure: Compiler Error Warnings Sample 2</w:t>
       </w:r>
     </w:p>
     <w:p>

</xml_diff>

<commit_message>
Expand responsibility matrix and configure headers/footers with dynamic page numbering
</commit_message>
<xml_diff>
--- a/Compiler_Design_Project_Report.docx
+++ b/Compiler_Design_Project_Report.docx
@@ -23,7 +23,7 @@
                     <pic:cNvPicPr/>
                   </pic:nvPicPr>
                   <pic:blipFill>
-                    <a:blip r:embed="rId9"/>
+                    <a:blip r:embed="rId11"/>
                     <a:stretch>
                       <a:fillRect/>
                     </a:stretch>
@@ -4499,7 +4499,7 @@
                     <pic:cNvPicPr/>
                   </pic:nvPicPr>
                   <pic:blipFill>
-                    <a:blip r:embed="rId10"/>
+                    <a:blip r:embed="rId12"/>
                     <a:stretch>
                       <a:fillRect/>
                     </a:stretch>
@@ -4554,7 +4554,7 @@
                     <pic:cNvPicPr/>
                   </pic:nvPicPr>
                   <pic:blipFill>
-                    <a:blip r:embed="rId11"/>
+                    <a:blip r:embed="rId13"/>
                     <a:stretch>
                       <a:fillRect/>
                     </a:stretch>
@@ -4609,7 +4609,7 @@
                     <pic:cNvPicPr/>
                   </pic:nvPicPr>
                   <pic:blipFill>
-                    <a:blip r:embed="rId12"/>
+                    <a:blip r:embed="rId14"/>
                     <a:stretch>
                       <a:fillRect/>
                     </a:stretch>
@@ -4664,7 +4664,7 @@
                     <pic:cNvPicPr/>
                   </pic:nvPicPr>
                   <pic:blipFill>
-                    <a:blip r:embed="rId13"/>
+                    <a:blip r:embed="rId15"/>
                     <a:stretch>
                       <a:fillRect/>
                     </a:stretch>
@@ -4737,7 +4737,7 @@
                     <pic:cNvPicPr/>
                   </pic:nvPicPr>
                   <pic:blipFill>
-                    <a:blip r:embed="rId14"/>
+                    <a:blip r:embed="rId16"/>
                     <a:stretch>
                       <a:fillRect/>
                     </a:stretch>
@@ -4792,7 +4792,7 @@
                     <pic:cNvPicPr/>
                   </pic:nvPicPr>
                   <pic:blipFill>
-                    <a:blip r:embed="rId15"/>
+                    <a:blip r:embed="rId17"/>
                     <a:stretch>
                       <a:fillRect/>
                     </a:stretch>
@@ -4847,7 +4847,7 @@
                     <pic:cNvPicPr/>
                   </pic:nvPicPr>
                   <pic:blipFill>
-                    <a:blip r:embed="rId16"/>
+                    <a:blip r:embed="rId18"/>
                     <a:stretch>
                       <a:fillRect/>
                     </a:stretch>
@@ -4920,7 +4920,7 @@
                     <pic:cNvPicPr/>
                   </pic:nvPicPr>
                   <pic:blipFill>
-                    <a:blip r:embed="rId17"/>
+                    <a:blip r:embed="rId19"/>
                     <a:stretch>
                       <a:fillRect/>
                     </a:stretch>
@@ -4975,7 +4975,7 @@
                     <pic:cNvPicPr/>
                   </pic:nvPicPr>
                   <pic:blipFill>
-                    <a:blip r:embed="rId18"/>
+                    <a:blip r:embed="rId20"/>
                     <a:stretch>
                       <a:fillRect/>
                     </a:stretch>
@@ -5406,7 +5406,7 @@
         <w:spacing w:before="60" w:after="120" w:line="276" w:lineRule="auto"/>
       </w:pPr>
       <w:r>
-        <w:t>For this project submission, the contributions of the group members are allocated as follows:</w:t>
+        <w:t>To guarantee a balanced workload and ensure maximum cohesion between the core compiler engine and the front-end dashboard, the division of labor was structured strictly. The group members collaborated on the overall system architecture, while dividing implementation tasks into specialized areas:</w:t>
       </w:r>
     </w:p>
     <w:p>
@@ -5414,14 +5414,298 @@
         <w:spacing w:before="0" w:after="80"/>
       </w:pPr>
     </w:p>
+    <w:p>
+      <w:pPr>
+        <w:keepNext/>
+        <w:spacing w:before="240" w:after="120"/>
+      </w:pPr>
+      <w:r>
+        <w:rPr>
+          <w:b/>
+          <w:color w:val="222222"/>
+          <w:sz w:val="23"/>
+        </w:rPr>
+        <w:t>15.1 Detailed Work Breakdown and Core Duties</w:t>
+      </w:r>
+    </w:p>
+    <w:p>
+      <w:pPr>
+        <w:spacing w:before="0" w:after="80"/>
+      </w:pPr>
+    </w:p>
+    <w:p>
+      <w:pPr>
+        <w:spacing w:before="60" w:after="60" w:line="276" w:lineRule="auto"/>
+      </w:pPr>
+      <w:r>
+        <w:rPr>
+          <w:rFonts w:ascii="Calibri" w:hAnsi="Calibri"/>
+          <w:b/>
+          <w:sz w:val="22"/>
+        </w:rPr>
+        <w:t>•  Sercan Özkan:</w:t>
+      </w:r>
+      <w:r>
+        <w:rPr>
+          <w:rFonts w:ascii="Calibri" w:hAnsi="Calibri"/>
+          <w:sz w:val="22"/>
+        </w:rPr>
+      </w:r>
+    </w:p>
+    <w:p>
+      <w:pPr>
+        <w:spacing w:before="60" w:after="120" w:line="276" w:lineRule="auto"/>
+      </w:pPr>
+      <w:r>
+        <w:t xml:space="preserve">  - </w:t>
+      </w:r>
+      <w:r>
+        <w:rPr>
+          <w:b/>
+        </w:rPr>
+        <w:t>DFA Lexical Analysis &amp; Scanner</w:t>
+      </w:r>
+      <w:r>
+        <w:t>: Programmed the scanner loop in `tokenize()`, implemented string/float literal state machines, lookahead resolution for double-character operators, and line/column metrics tracking.</w:t>
+      </w:r>
+    </w:p>
+    <w:p>
+      <w:pPr>
+        <w:spacing w:before="60" w:after="120" w:line="276" w:lineRule="auto"/>
+      </w:pPr>
+      <w:r>
+        <w:t xml:space="preserve">  - </w:t>
+      </w:r>
+      <w:r>
+        <w:rPr>
+          <w:b/>
+        </w:rPr>
+        <w:t>Syntax Parsing (Recursive Descent)</w:t>
+      </w:r>
+      <w:r>
+        <w:t>: Coded the LL(1) grammar parser rules (statements, selections, iterations, expressions, primary nodes) and established operator precedence hierarchy.</w:t>
+      </w:r>
+    </w:p>
+    <w:p>
+      <w:pPr>
+        <w:spacing w:before="60" w:after="120" w:line="276" w:lineRule="auto"/>
+      </w:pPr>
+      <w:r>
+        <w:t xml:space="preserve">  - </w:t>
+      </w:r>
+      <w:r>
+        <w:rPr>
+          <w:b/>
+        </w:rPr>
+        <w:t>Symbol Table Stack</w:t>
+      </w:r>
+      <w:r>
+        <w:t>: Engineered the stack of Maps representing local block scopes.</w:t>
+      </w:r>
+    </w:p>
+    <w:p>
+      <w:pPr>
+        <w:spacing w:before="60" w:after="120" w:line="276" w:lineRule="auto"/>
+      </w:pPr>
+      <w:r>
+        <w:t xml:space="preserve">  - </w:t>
+      </w:r>
+      <w:r>
+        <w:rPr>
+          <w:b/>
+        </w:rPr>
+        <w:t>Intermediate Code (TAC) Generation</w:t>
+      </w:r>
+      <w:r>
+        <w:t>: Programmed the linearized TAC translation walk including register (`t0`, `t1`...) and branching label (`L0`, `L1`...) generation, and implemented the variable scope suffixing (`x_0`, `x_1`) shadowing resolution.</w:t>
+      </w:r>
+    </w:p>
+    <w:p>
+      <w:pPr>
+        <w:spacing w:before="0" w:after="80"/>
+      </w:pPr>
+    </w:p>
+    <w:p>
+      <w:pPr>
+        <w:spacing w:before="60" w:after="60" w:line="276" w:lineRule="auto"/>
+      </w:pPr>
+      <w:r>
+        <w:rPr>
+          <w:rFonts w:ascii="Calibri" w:hAnsi="Calibri"/>
+          <w:b/>
+          <w:sz w:val="22"/>
+        </w:rPr>
+        <w:t>•  Berat Kahraman:</w:t>
+      </w:r>
+      <w:r>
+        <w:rPr>
+          <w:rFonts w:ascii="Calibri" w:hAnsi="Calibri"/>
+          <w:sz w:val="22"/>
+        </w:rPr>
+      </w:r>
+    </w:p>
+    <w:p>
+      <w:pPr>
+        <w:spacing w:before="60" w:after="120" w:line="276" w:lineRule="auto"/>
+      </w:pPr>
+      <w:r>
+        <w:t xml:space="preserve">  - </w:t>
+      </w:r>
+      <w:r>
+        <w:rPr>
+          <w:b/>
+        </w:rPr>
+        <w:t>Static Semantics &amp; Type Safety Checking</w:t>
+      </w:r>
+      <w:r>
+        <w:t>: Implemented scoping verification (undeclared and redeclared checks) and type compatibility checks for assignments, arithmetic, and logical operations, including compile-time division by zero checks.</w:t>
+      </w:r>
+    </w:p>
+    <w:p>
+      <w:pPr>
+        <w:spacing w:before="60" w:after="120" w:line="276" w:lineRule="auto"/>
+      </w:pPr>
+      <w:r>
+        <w:t xml:space="preserve">  - </w:t>
+      </w:r>
+      <w:r>
+        <w:rPr>
+          <w:b/>
+        </w:rPr>
+        <w:t>Memory Layout Simulator</w:t>
+      </w:r>
+      <w:r>
+        <w:t>: Configured global offset counters allocating 4 bytes for `int` and 8 bytes for `float` variables.</w:t>
+      </w:r>
+    </w:p>
+    <w:p>
+      <w:pPr>
+        <w:spacing w:before="60" w:after="120" w:line="276" w:lineRule="auto"/>
+      </w:pPr>
+      <w:r>
+        <w:t xml:space="preserve">  - </w:t>
+      </w:r>
+      <w:r>
+        <w:rPr>
+          <w:b/>
+        </w:rPr>
+        <w:t>Visual GUI &amp; Gutter Line Sync</w:t>
+      </w:r>
+      <w:r>
+        <w:t>: Designed the cyberpunk OS dashboard interface, editor gutters, draggable window wrappers, diagnostic error cards, and implemented HTML5 `FileReader` file uploads.</w:t>
+      </w:r>
+    </w:p>
+    <w:p>
+      <w:pPr>
+        <w:spacing w:before="60" w:after="120" w:line="276" w:lineRule="auto"/>
+      </w:pPr>
+      <w:r>
+        <w:t xml:space="preserve">  - </w:t>
+      </w:r>
+      <w:r>
+        <w:rPr>
+          <w:b/>
+        </w:rPr>
+        <w:t>Academic Documentation</w:t>
+      </w:r>
+      <w:r>
+        <w:t>: Structured the BNF grammar representation, compiler methodology flowchart, memory offset charts, challenges walkthroughs, and configured automated word report compilation scripts.</w:t>
+      </w:r>
+    </w:p>
+    <w:p>
+      <w:pPr>
+        <w:spacing w:before="0" w:after="80"/>
+      </w:pPr>
+    </w:p>
+    <w:p>
+      <w:pPr>
+        <w:keepNext/>
+        <w:spacing w:before="240" w:after="120"/>
+      </w:pPr>
+      <w:r>
+        <w:rPr>
+          <w:b/>
+          <w:color w:val="222222"/>
+          <w:sz w:val="23"/>
+        </w:rPr>
+        <w:t>15.2 Distribution of Project Contributions</w:t>
+      </w:r>
+    </w:p>
+    <w:p>
+      <w:pPr>
+        <w:spacing w:before="0" w:after="80"/>
+      </w:pPr>
+    </w:p>
     <w:sectPr>
+      <w:headerReference w:type="default" r:id="rId9"/>
+      <w:footerReference w:type="default" r:id="rId10"/>
       <w:pgSz w:w="12240" w:h="15840"/>
       <w:pgMar w:top="1440" w:right="1440" w:bottom="1440" w:left="1440" w:header="720" w:footer="720" w:gutter="0"/>
       <w:cols w:space="720"/>
+      <w:titlePg/>
       <w:docGrid w:linePitch="360"/>
     </w:sectPr>
   </w:body>
 </w:document>
+</file>
+
+<file path=word/footer1.xml><?xml version="1.0" encoding="utf-8"?>
+<w:ftr xmlns:m="http://schemas.openxmlformats.org/officeDocument/2006/math" xmlns:mc="http://schemas.openxmlformats.org/markup-compatibility/2006" xmlns:mo="http://schemas.microsoft.com/office/mac/office/2008/main" xmlns:mv="urn:schemas-microsoft-com:mac:vml" xmlns:o="urn:schemas-microsoft-com:office:office" xmlns:r="http://schemas.openxmlformats.org/officeDocument/2006/relationships" xmlns:v="urn:schemas-microsoft-com:vml" xmlns:w10="urn:schemas-microsoft-com:office:word" xmlns:w14="http://schemas.microsoft.com/office/word/2010/wordml" xmlns:w="http://schemas.openxmlformats.org/wordprocessingml/2006/main" xmlns:wne="http://schemas.microsoft.com/office/word/2006/wordml" xmlns:wp14="http://schemas.microsoft.com/office/word/2010/wordprocessingDrawing" xmlns:wp="http://schemas.openxmlformats.org/drawingml/2006/wordprocessingDrawing" xmlns:wpc="http://schemas.microsoft.com/office/word/2010/wordprocessingCanvas" xmlns:wpg="http://schemas.microsoft.com/office/word/2010/wordprocessingGroup" xmlns:wpi="http://schemas.microsoft.com/office/word/2010/wordprocessingInk" xmlns:wps="http://schemas.microsoft.com/office/word/2010/wordprocessingShape" mc:Ignorable="w14 wp14">
+  <w:p>
+    <w:pPr>
+      <w:pStyle w:val="Footer"/>
+      <w:tabs>
+        <w:tab w:pos="9360" w:val="right"/>
+      </w:tabs>
+      <w:spacing w:before="240" w:after="0"/>
+    </w:pPr>
+    <w:r>
+      <w:rPr>
+        <w:rFonts w:ascii="Calibri" w:hAnsi="Calibri"/>
+        <w:color w:val="8A8A8A"/>
+        <w:sz w:val="17"/>
+      </w:rPr>
+      <w:t>System Programming - Two-Pass Compiler Project</w:t>
+    </w:r>
+    <w:r>
+      <w:tab/>
+    </w:r>
+    <w:r>
+      <w:rPr>
+        <w:rFonts w:ascii="Calibri" w:hAnsi="Calibri"/>
+        <w:color w:val="8A8A8A"/>
+        <w:sz w:val="17"/>
+      </w:rPr>
+      <w:t xml:space="preserve">Page </w:t>
+    </w:r>
+    <w:r>
+      <w:fldChar w:fldCharType="begin"/>
+      <w:instrText xml:space="preserve">PAGE</w:instrText>
+      <w:fldChar w:fldCharType="end"/>
+    </w:r>
+  </w:p>
+</w:ftr>
+</file>
+
+<file path=word/header1.xml><?xml version="1.0" encoding="utf-8"?>
+<w:hdr xmlns:m="http://schemas.openxmlformats.org/officeDocument/2006/math" xmlns:mc="http://schemas.openxmlformats.org/markup-compatibility/2006" xmlns:mo="http://schemas.microsoft.com/office/mac/office/2008/main" xmlns:mv="urn:schemas-microsoft-com:mac:vml" xmlns:o="urn:schemas-microsoft-com:office:office" xmlns:r="http://schemas.openxmlformats.org/officeDocument/2006/relationships" xmlns:v="urn:schemas-microsoft-com:vml" xmlns:w10="urn:schemas-microsoft-com:office:word" xmlns:w14="http://schemas.microsoft.com/office/word/2010/wordml" xmlns:w="http://schemas.openxmlformats.org/wordprocessingml/2006/main" xmlns:wne="http://schemas.microsoft.com/office/word/2006/wordml" xmlns:wp14="http://schemas.microsoft.com/office/word/2010/wordprocessingDrawing" xmlns:wp="http://schemas.openxmlformats.org/drawingml/2006/wordprocessingDrawing" xmlns:wpc="http://schemas.microsoft.com/office/word/2010/wordprocessingCanvas" xmlns:wpg="http://schemas.microsoft.com/office/word/2010/wordprocessingGroup" xmlns:wpi="http://schemas.microsoft.com/office/word/2010/wordprocessingInk" xmlns:wps="http://schemas.microsoft.com/office/word/2010/wordprocessingShape" mc:Ignorable="w14 wp14">
+  <w:p>
+    <w:pPr>
+      <w:pStyle w:val="Header"/>
+      <w:spacing w:before="0" w:after="240"/>
+      <w:jc w:val="right"/>
+    </w:pPr>
+    <w:r>
+      <w:rPr>
+        <w:rFonts w:ascii="Calibri" w:hAnsi="Calibri"/>
+        <w:i/>
+        <w:color w:val="8A8A8A"/>
+        <w:sz w:val="17"/>
+      </w:rPr>
+      <w:t>İSTÜN | DEPARTMENT OF COMPUTER ENGINEERING</w:t>
+    </w:r>
+  </w:p>
+</w:hdr>
 </file>
 
 <file path=word/numbering.xml><?xml version="1.0" encoding="utf-8"?>

</xml_diff>